<commit_message>
Agregar el nombre del estudiante al encabezado de los talleres
Co-Authored-By: Claude Opus 5.5 <noreply@anthropic.com>
Claude-Session: https://claude.ai/code/session_016aF9fL47fNCWzYoErU9esT
</commit_message>
<xml_diff>
--- a/talleres/documentos/Taller1-Mientras-SOLUCION.docx
+++ b/talleres/documentos/Taller1-Mientras-SOLUCION.docx
@@ -256,6 +256,52 @@
                 <w:rFonts w:ascii="Arial" w:hAnsi="Arial" w:cs="Arial"/>
               </w:rPr>
             </w:pPr>
+          </w:p>
+        </w:tc>
+      </w:tr>
+      <w:tr>
+        <w:trPr>
+          <w:trHeight w:val="697"/>
+        </w:trPr>
+        <w:tc>
+          <w:tcPr>
+            <w:tcW w:w="10207" w:type="dxa"/>
+            <w:gridSpan w:val="3"/>
+            <w:tcBorders>
+              <w:top w:val="single" w:sz="4" w:space="0" w:color="auto"/>
+              <w:left w:val="single" w:sz="4" w:space="0" w:color="auto"/>
+              <w:bottom w:val="single" w:sz="4" w:space="0" w:color="auto"/>
+              <w:right w:val="single" w:sz="4" w:space="0" w:color="auto"/>
+            </w:tcBorders>
+            <w:vAlign w:val="center"/>
+          </w:tcPr>
+          <w:p>
+            <w:pPr>
+              <w:pStyle w:val="Sinespaciado"/>
+              <w:rPr>
+                <w:rFonts w:ascii="Arial" w:hAnsi="Arial" w:cs="Arial"/>
+              </w:rPr>
+            </w:pPr>
+            <w:r>
+              <w:rPr>
+                <w:rFonts w:ascii="Arial" w:hAnsi="Arial" w:cs="Arial"/>
+              </w:rPr>
+              <w:t xml:space="preserve">Estudiante: </w:t>
+            </w:r>
+          </w:p>
+          <w:p>
+            <w:pPr>
+              <w:pStyle w:val="Sinespaciado"/>
+              <w:rPr>
+                <w:rFonts w:ascii="Arial" w:hAnsi="Arial" w:cs="Arial"/>
+              </w:rPr>
+            </w:pPr>
+            <w:r>
+              <w:rPr>
+                <w:rFonts w:ascii="Arial" w:hAnsi="Arial" w:cs="Arial"/>
+              </w:rPr>
+              <w:t xml:space="preserve">Samuel Muñoz Vargas</w:t>
+            </w:r>
           </w:p>
         </w:tc>
       </w:tr>

</xml_diff>